<commit_message>
Version 1.1.4 - quitar mensajes de Nax y mensaje de creacion de regularizacion
</commit_message>
<xml_diff>
--- a/Docs/Solherbs –  Funcionamiento de la dll.docx
+++ b/Docs/Solherbs –  Funcionamiento de la dll.docx
@@ -84,15 +84,7 @@
         </w:tabs>
       </w:pPr>
       <w:r>
-        <w:t xml:space="preserve">Estos costes pueden ser sumados los costes de las líneas del albarán, o no, dependiendo de si está marcado el </w:t>
-      </w:r>
-      <w:proofErr w:type="spellStart"/>
-      <w:r>
-        <w:t>check</w:t>
-      </w:r>
-      <w:proofErr w:type="spellEnd"/>
-      <w:r>
-        <w:t xml:space="preserve"> de sumar o no.</w:t>
+        <w:t>Estos costes pueden ser sumados los costes de las líneas del albarán, o no, dependiendo de si está marcado el check de sumar o no.</w:t>
       </w:r>
     </w:p>
     <w:p>
@@ -102,15 +94,7 @@
         </w:tabs>
       </w:pPr>
       <w:r>
-        <w:t xml:space="preserve">Cuando se guarda el albarán de venta, se suman los costes indicados en esta tabla que tengan marcado el </w:t>
-      </w:r>
-      <w:proofErr w:type="spellStart"/>
-      <w:r>
-        <w:t>check</w:t>
-      </w:r>
-      <w:proofErr w:type="spellEnd"/>
-      <w:r>
-        <w:t>.</w:t>
+        <w:t>Cuando se guarda el albarán de venta, se suman los costes indicados en esta tabla que tengan marcado el check.</w:t>
       </w:r>
     </w:p>
     <w:p>
@@ -126,13 +110,8 @@
         <w:t xml:space="preserve"> que no tengan indicado el coste manual</w:t>
       </w:r>
       <w:r>
-        <w:t xml:space="preserve"> o , de todas, en el caso de que así se haya indicado en la </w:t>
+        <w:t xml:space="preserve"> o , de todas, en el caso de que así se haya indicado en la configuracion</w:t>
       </w:r>
-      <w:proofErr w:type="spellStart"/>
-      <w:r>
-        <w:t>configuracion</w:t>
-      </w:r>
-      <w:proofErr w:type="spellEnd"/>
       <w:r>
         <w:t>, para obtener el coste por unidad que hay que sumar a la línea.</w:t>
       </w:r>
@@ -153,23 +132,10 @@
         <w:t xml:space="preserve"> </w:t>
       </w:r>
       <w:r>
-        <w:t xml:space="preserve">, para todas, en el caso de que así se haya indicado en la </w:t>
+        <w:t>, para todas, en el caso de que así se haya indicado en la configuracion</w:t>
       </w:r>
-      <w:proofErr w:type="spellStart"/>
       <w:r>
-        <w:t>configuracion</w:t>
-      </w:r>
-      <w:proofErr w:type="spellEnd"/>
-      <w:r>
-        <w:t xml:space="preserve">, se suma este importe por unidad al coste que calcula </w:t>
-      </w:r>
-      <w:proofErr w:type="spellStart"/>
-      <w:r>
-        <w:t>nax</w:t>
-      </w:r>
-      <w:proofErr w:type="spellEnd"/>
-      <w:r>
-        <w:t xml:space="preserve"> para esa línea.</w:t>
+        <w:t>, se suma este importe por unidad al coste que calcula nax para esa línea.</w:t>
       </w:r>
     </w:p>
     <w:p>
@@ -179,15 +145,7 @@
         </w:tabs>
       </w:pPr>
       <w:r>
-        <w:t xml:space="preserve">Este precio de coste de cálculo de </w:t>
-      </w:r>
-      <w:proofErr w:type="spellStart"/>
-      <w:r>
-        <w:t>Nax</w:t>
-      </w:r>
-      <w:proofErr w:type="spellEnd"/>
-      <w:r>
-        <w:t xml:space="preserve"> se recalcula siempre antes de sumar los costes adicionales, para que en las modificaciones no se sume al coste ya grabado en la línea, sino que se vuelva a realizar el cálculo, sino, se sumarian varias veces los costea adicionales, una vez por cada grabado del documento que hiciéramos.</w:t>
+        <w:t>Este precio de coste de cálculo de Nax se recalcula siempre antes de sumar los costes adicionales, para que en las modificaciones no se sume al coste ya grabado en la línea, sino que se vuelva a realizar el cálculo, sino, se sumarian varias veces los costea adicionales, una vez por cada grabado del documento que hiciéramos.</w:t>
       </w:r>
     </w:p>
     <w:p>
@@ -214,16 +172,11 @@
       <w:r>
         <w:t xml:space="preserve">Para excluir esta funcionalidad para algunos usuarios concretos habrá que indicar el nombre de los usuarios de a3erp separados por comas en el parámetro </w:t>
       </w:r>
-      <w:proofErr w:type="spellStart"/>
       <w:r>
         <w:t>UsuariosExcluidosCostes</w:t>
       </w:r>
-      <w:proofErr w:type="spellEnd"/>
       <w:r>
-        <w:t xml:space="preserve"> </w:t>
-      </w:r>
-      <w:r>
-        <w:t>de la configuración.</w:t>
+        <w:t xml:space="preserve"> de la configuración.</w:t>
       </w:r>
     </w:p>
     <w:p>
@@ -277,11 +230,9 @@
       <w:r>
         <w:t xml:space="preserve">Para excluir esta funcionalidad para algunos usuarios concretos habrá que indicar el nombre de los usuarios de a3erp separados por comas en el parámetro </w:t>
       </w:r>
-      <w:proofErr w:type="spellStart"/>
       <w:r>
         <w:t>UsuariosExcluidosCajas</w:t>
       </w:r>
-      <w:proofErr w:type="spellEnd"/>
       <w:r>
         <w:t xml:space="preserve"> de la configuración.</w:t>
       </w:r>
@@ -306,7 +257,7 @@
         <w:pStyle w:val="Ttulo2"/>
       </w:pPr>
       <w:r>
-        <w:t>Costes adicionales</w:t>
+        <w:t>Calculo de lotes</w:t>
       </w:r>
     </w:p>
     <w:p>
@@ -322,13 +273,8 @@
       <w:r>
         <w:t xml:space="preserve">, ejemplo: si es viernes el día de la generación del lote sería posición 5, estamos en la semana 36 y el </w:t>
       </w:r>
-      <w:proofErr w:type="spellStart"/>
       <w:r>
-        <w:t>param</w:t>
-      </w:r>
-      <w:proofErr w:type="spellEnd"/>
-      <w:r>
-        <w:t xml:space="preserve"> 1 del </w:t>
+        <w:t xml:space="preserve">param 1 del </w:t>
       </w:r>
       <w:r>
         <w:t>proveedor es  127: 263605127 </w:t>
@@ -358,11 +304,12 @@
       <w:r>
         <w:t xml:space="preserve">Para excluir esta funcionalidad para algunos usuarios concretos habrá que indicar el nombre de los usuarios de a3erp separados por comas en el parámetro </w:t>
       </w:r>
-      <w:proofErr w:type="spellStart"/>
       <w:r>
-        <w:t>UsuariosExcluidosCostes</w:t>
+        <w:t>UsuariosExcluidos</w:t>
       </w:r>
-      <w:proofErr w:type="spellEnd"/>
+      <w:r>
+        <w:t>Lotes</w:t>
+      </w:r>
       <w:r>
         <w:t xml:space="preserve"> de la configuración.</w:t>
       </w:r>
@@ -383,19 +330,7 @@
     </w:p>
     <w:p>
       <w:r>
-        <w:t xml:space="preserve">Tendremos en cuenta también las unidades por paquete de venta del </w:t>
-      </w:r>
-      <w:r>
-        <w:t>artículo</w:t>
-      </w:r>
-      <w:r>
-        <w:t xml:space="preserve"> como las unidades que van en cada caja (</w:t>
-      </w:r>
-      <w:r>
-        <w:t>artículo</w:t>
-      </w:r>
-      <w:r>
-        <w:t xml:space="preserve"> alternativo) de ese artículo.</w:t>
+        <w:t>Tendremos en cuenta también las unidades por paquete de venta del artículo como las unidades que van en cada caja (artículo alternativo) de ese artículo.</w:t>
       </w:r>
     </w:p>
     <w:p>
@@ -405,31 +340,7 @@
         </w:tabs>
       </w:pPr>
       <w:r>
-        <w:t xml:space="preserve">Tras guardar un albarán de </w:t>
-      </w:r>
-      <w:r>
-        <w:t>compra</w:t>
-      </w:r>
-      <w:r>
-        <w:t xml:space="preserve">, se recorrerán las líneas del albarán viendo aquellos artículos que tienen cajas asociadas, es decir, un </w:t>
-      </w:r>
-      <w:r>
-        <w:t>artículo</w:t>
-      </w:r>
-      <w:r>
-        <w:t xml:space="preserve"> indicado en el </w:t>
-      </w:r>
-      <w:r>
-        <w:t>artículo</w:t>
-      </w:r>
-      <w:r>
-        <w:t xml:space="preserve"> alternativo y se calcularán las cajas necesarias para las unidades de la línea, teniendo en cuenta las unidades por paquete de </w:t>
-      </w:r>
-      <w:r>
-        <w:t>compra</w:t>
-      </w:r>
-      <w:r>
-        <w:t>.</w:t>
+        <w:t>Tras guardar un albarán de compra, se recorrerán las líneas del albarán viendo aquellos artículos que tienen cajas asociadas, es decir, un artículo indicado en el artículo alternativo y se calcularán las cajas necesarias para las unidades de la línea, teniendo en cuenta las unidades por paquete de compra.</w:t>
       </w:r>
     </w:p>
     <w:p>
@@ -447,16 +358,11 @@
       <w:r>
         <w:t xml:space="preserve">Para excluir esta funcionalidad para algunos usuarios concretos habrá que indicar el nombre de los usuarios de a3erp separados por comas en el parámetro </w:t>
       </w:r>
-      <w:proofErr w:type="spellStart"/>
       <w:r>
         <w:t>UsuariosExcluidosCajas</w:t>
       </w:r>
-      <w:proofErr w:type="spellEnd"/>
       <w:r>
-        <w:t xml:space="preserve"> </w:t>
-      </w:r>
-      <w:r>
-        <w:t>de la configuración.</w:t>
+        <w:t xml:space="preserve"> de la configuración.</w:t>
       </w:r>
     </w:p>
     <w:p>
@@ -491,11 +397,9 @@
       <w:r>
         <w:t xml:space="preserve">Para excluir esta funcionalidad para algunos usuarios concretos habrá que indicar el nombre de los usuarios de a3erp separados por comas en el parámetro </w:t>
       </w:r>
-      <w:proofErr w:type="spellStart"/>
       <w:r>
         <w:t>UsuariosExcluidosPaquetes</w:t>
       </w:r>
-      <w:proofErr w:type="spellEnd"/>
       <w:r>
         <w:t xml:space="preserve"> de la configuración.</w:t>
       </w:r>
@@ -1036,14 +940,12 @@
                             </w:rPr>
                             <w:t xml:space="preserve">   </w:t>
                           </w:r>
-                          <w:proofErr w:type="spellStart"/>
                           <w:r>
                             <w:rPr>
                               <w:b/>
                             </w:rPr>
                             <w:t>Solherbs</w:t>
                           </w:r>
-                          <w:proofErr w:type="spellEnd"/>
                           <w:r>
                             <w:rPr>
                               <w:b/>
@@ -1054,35 +956,13 @@
                             <w:rPr>
                               <w:b/>
                             </w:rPr>
-                            <w:t xml:space="preserve"> Costes adicionales. Funcionamiento de la </w:t>
+                            <w:t xml:space="preserve"> Costes adicionales. Funcionamiento de la dll</w:t>
                           </w:r>
-                          <w:proofErr w:type="spellStart"/>
                           <w:r>
                             <w:rPr>
                               <w:b/>
                             </w:rPr>
-                            <w:t>dll</w:t>
-                          </w:r>
-                          <w:proofErr w:type="spellEnd"/>
-                          <w:r>
-                            <w:rPr>
-                              <w:b/>
-                            </w:rPr>
-                            <w:t xml:space="preserve">. </w:t>
-                          </w:r>
-                          <w:proofErr w:type="spellStart"/>
-                          <w:r>
-                            <w:rPr>
-                              <w:b/>
-                            </w:rPr>
-                            <w:t>Version</w:t>
-                          </w:r>
-                          <w:proofErr w:type="spellEnd"/>
-                          <w:r>
-                            <w:rPr>
-                              <w:b/>
-                            </w:rPr>
-                            <w:t xml:space="preserve"> 1.</w:t>
+                            <w:t>. Version 1.</w:t>
                           </w:r>
                           <w:r>
                             <w:rPr>

</xml_diff>